<commit_message>
note cran submission in text
</commit_message>
<xml_diff>
--- a/paper/tutorial_brm.docx
+++ b/paper/tutorial_brm.docx
@@ -590,7 +590,10 @@
         </w:r>
       </w:hyperlink>
       <w:r>
-        <w:t xml:space="preserve">, with a CRAN release planned.</w:t>
+        <w:t xml:space="preserve"> </w:t>
+      </w:r>
+      <w:r>
+        <w:t xml:space="preserve">and has been submitted to CRAN.</w:t>
       </w:r>
     </w:p>
     <w:bookmarkEnd w:id="10"/>

</xml_diff>

<commit_message>
point readme at the tutorial manuscript and cran package
</commit_message>
<xml_diff>
--- a/paper/tutorial_brm.docx
+++ b/paper/tutorial_brm.docx
@@ -9361,38 +9361,41 @@
         </w:r>
       </w:hyperlink>
       <w:r>
-        <w:t xml:space="preserve">,</w:t>
-      </w:r>
-      <w:r>
-        <w:t xml:space="preserve"> </w:t>
-      </w:r>
-      <w:r>
-        <w:t xml:space="preserve">with a CRAN release planned; a DOI-archived copy of the code and package is deposited at [OSF/Zenodo DOI</w:t>
-      </w:r>
-      <w:r>
-        <w:t xml:space="preserve"> </w:t>
-      </w:r>
-      <w:r>
-        <w:t xml:space="preserve">to be minted at submission]. The confirmatory analysis of the worked example, its decision</w:t>
-      </w:r>
-      <w:r>
-        <w:t xml:space="preserve"> </w:t>
-      </w:r>
-      <w:r>
-        <w:t xml:space="preserve">rule, and its specification grid were preregistered on the Open Science Framework before the</w:t>
-      </w:r>
-      <w:r>
-        <w:t xml:space="preserve"> </w:t>
-      </w:r>
-      <w:r>
-        <w:t xml:space="preserve">held-out data were opened (</w:t>
+        <w:t xml:space="preserve"> </w:t>
+      </w:r>
+      <w:r>
+        <w:t xml:space="preserve">and has been submitted to CRAN. The confirmatory analysis of the worked example, its decision</w:t>
+      </w:r>
+      <w:r>
+        <w:t xml:space="preserve"> </w:t>
+      </w:r>
+      <w:r>
+        <w:t xml:space="preserve">rule, its specification grid, and the analysis code were preregistered and archived on the</w:t>
+      </w:r>
+      <w:r>
+        <w:t xml:space="preserve"> </w:t>
+      </w:r>
+      <w:r>
+        <w:t xml:space="preserve">Open Science Framework before the held-out data were opened, as a frozen, time-stamped</w:t>
+      </w:r>
+      <w:r>
+        <w:t xml:space="preserve"> </w:t>
+      </w:r>
+      <w:r>
+        <w:t xml:space="preserve">registration with a persistent identifier</w:t>
+      </w:r>
+      <w:r>
+        <w:t xml:space="preserve"> </w:t>
+      </w:r>
+      <w:r>
+        <w:t xml:space="preserve">(</w:t>
       </w:r>
       <w:hyperlink r:id="rId41">
         <w:r>
           <w:rPr>
             <w:rStyle w:val="Hyperlink"/>
           </w:rPr>
-          <w:t xml:space="preserve">https://osf.io/2ekcg</w:t>
+          <w:t xml:space="preserve">https://doi.org/10.17605/OSF.IO/2EKCG</w:t>
         </w:r>
       </w:hyperlink>
       <w:r>

</xml_diff>